<commit_message>
Aula 2 de MD
</commit_message>
<xml_diff>
--- a/UNIUBE-MD/Conteudo.docx
+++ b/UNIUBE-MD/Conteudo.docx
@@ -201,23 +201,35 @@
       <w:pPr>
         <w:pStyle w:val="PargrafodaLista"/>
         <w:numPr>
-          <w:ilvl w:val="0"/>
+          <w:ilvl w:val="1"/>
           <w:numId w:val="5"/>
         </w:numPr>
       </w:pPr>
       <w:r>
-        <w:t>De Morgan</w:t>
-      </w:r>
-    </w:p>
-    <w:p>
-      <w:pPr>
-        <w:pStyle w:val="PargrafodaLista"/>
-        <w:numPr>
-          <w:ilvl w:val="0"/>
+        <w:t>L</w:t>
+      </w:r>
+      <w:r>
+        <w:t>e</w:t>
+      </w:r>
+      <w:r>
+        <w:t>i de</w:t>
+      </w:r>
+      <w:r>
+        <w:t xml:space="preserve"> Morgan</w:t>
+      </w:r>
+    </w:p>
+    <w:p>
+      <w:pPr>
+        <w:pStyle w:val="PargrafodaLista"/>
+        <w:numPr>
+          <w:ilvl w:val="1"/>
           <w:numId w:val="5"/>
         </w:numPr>
       </w:pPr>
       <w:r>
+        <w:t xml:space="preserve">Propriedade da </w:t>
+      </w:r>
+      <w:r>
         <w:t>A</w:t>
       </w:r>
       <w:r>
@@ -228,11 +240,17 @@
       <w:pPr>
         <w:pStyle w:val="PargrafodaLista"/>
         <w:numPr>
-          <w:ilvl w:val="0"/>
+          <w:ilvl w:val="1"/>
           <w:numId w:val="5"/>
         </w:numPr>
       </w:pPr>
       <w:r>
+        <w:t>Propriedade</w:t>
+      </w:r>
+      <w:r>
+        <w:t xml:space="preserve"> de </w:t>
+      </w:r>
+      <w:r>
         <w:t>D</w:t>
       </w:r>
       <w:r>
@@ -243,15 +261,42 @@
       <w:pPr>
         <w:pStyle w:val="PargrafodaLista"/>
         <w:numPr>
-          <w:ilvl w:val="0"/>
+          <w:ilvl w:val="1"/>
           <w:numId w:val="5"/>
         </w:numPr>
       </w:pPr>
       <w:r>
+        <w:t>Propriedade Associativa</w:t>
+      </w:r>
+    </w:p>
+    <w:p>
+      <w:pPr>
+        <w:pStyle w:val="PargrafodaLista"/>
+        <w:numPr>
+          <w:ilvl w:val="0"/>
+          <w:numId w:val="5"/>
+        </w:numPr>
+      </w:pPr>
+      <w:r>
+        <w:t>Propriedades Operacionais</w:t>
+      </w:r>
+    </w:p>
+    <w:p>
+      <w:pPr>
+        <w:pStyle w:val="PargrafodaLista"/>
+        <w:numPr>
+          <w:ilvl w:val="0"/>
+          <w:numId w:val="5"/>
+        </w:numPr>
+      </w:pPr>
+      <w:r>
         <w:t>S</w:t>
       </w:r>
       <w:r>
         <w:t>implificação</w:t>
+      </w:r>
+      <w:r>
+        <w:t xml:space="preserve"> de Expressões</w:t>
       </w:r>
     </w:p>
     <w:p>
@@ -319,12 +364,15 @@
       <w:r>
         <w:t>egras de inferência</w:t>
       </w:r>
-    </w:p>
-    <w:p>
-      <w:pPr>
-        <w:pStyle w:val="PargrafodaLista"/>
-        <w:numPr>
-          <w:ilvl w:val="0"/>
+      <w:r>
+        <w:t>:</w:t>
+      </w:r>
+    </w:p>
+    <w:p>
+      <w:pPr>
+        <w:pStyle w:val="PargrafodaLista"/>
+        <w:numPr>
+          <w:ilvl w:val="1"/>
           <w:numId w:val="6"/>
         </w:numPr>
       </w:pPr>
@@ -339,7 +387,7 @@
       <w:pPr>
         <w:pStyle w:val="PargrafodaLista"/>
         <w:numPr>
-          <w:ilvl w:val="0"/>
+          <w:ilvl w:val="1"/>
           <w:numId w:val="6"/>
         </w:numPr>
       </w:pPr>
@@ -354,7 +402,7 @@
       <w:pPr>
         <w:pStyle w:val="PargrafodaLista"/>
         <w:numPr>
-          <w:ilvl w:val="0"/>
+          <w:ilvl w:val="1"/>
           <w:numId w:val="6"/>
         </w:numPr>
       </w:pPr>
@@ -591,7 +639,6 @@
           <w:b/>
           <w:bCs/>
         </w:rPr>
-        <w:lastRenderedPageBreak/>
         <w:t>Unidade 7 — Álgebra Booleana</w:t>
       </w:r>
     </w:p>
@@ -877,6 +924,15 @@
       <w:r>
         <w:t>elações</w:t>
       </w:r>
+      <w:r>
+        <w:t xml:space="preserve"> e suas </w:t>
+      </w:r>
+      <w:r>
+        <w:t>P</w:t>
+      </w:r>
+      <w:r>
+        <w:t>ropriedades</w:t>
+      </w:r>
     </w:p>
     <w:p>
       <w:pPr>
@@ -888,10 +944,7 @@
         <w:spacing w:after="0"/>
       </w:pPr>
       <w:r>
-        <w:t>P</w:t>
-      </w:r>
-      <w:r>
-        <w:t>ropriedades</w:t>
+        <w:t>Relações de Ordem e Equivalência</w:t>
       </w:r>
     </w:p>
     <w:p>
@@ -1076,7 +1129,7 @@
         <w:rFonts w:ascii="Symbol" w:hAnsi="Symbol" w:hint="default"/>
       </w:rPr>
     </w:lvl>
-    <w:lvl w:ilvl="1" w:tplc="04160003" w:tentative="1">
+    <w:lvl w:ilvl="1" w:tplc="04160003">
       <w:start w:val="1"/>
       <w:numFmt w:val="bullet"/>
       <w:lvlText w:val="o"/>
@@ -1826,7 +1879,7 @@
         <w:rFonts w:ascii="Symbol" w:hAnsi="Symbol" w:hint="default"/>
       </w:rPr>
     </w:lvl>
-    <w:lvl w:ilvl="1" w:tplc="04160003" w:tentative="1">
+    <w:lvl w:ilvl="1" w:tplc="04160003">
       <w:start w:val="1"/>
       <w:numFmt w:val="bullet"/>
       <w:lvlText w:val="o"/>

</xml_diff>

<commit_message>
Atualização de aulas de MD 14/08
</commit_message>
<xml_diff>
--- a/UNIUBE-MD/Conteudo.docx
+++ b/UNIUBE-MD/Conteudo.docx
@@ -2,6 +2,21 @@
 <file path=word/document.xml><?xml version="1.0" encoding="utf-8"?>
 <w:document xmlns:wpc="http://schemas.microsoft.com/office/word/2010/wordprocessingCanvas" xmlns:cx="http://schemas.microsoft.com/office/drawing/2014/chartex" xmlns:cx1="http://schemas.microsoft.com/office/drawing/2015/9/8/chartex" xmlns:cx2="http://schemas.microsoft.com/office/drawing/2015/10/21/chartex" xmlns:cx3="http://schemas.microsoft.com/office/drawing/2016/5/9/chartex" xmlns:cx4="http://schemas.microsoft.com/office/drawing/2016/5/10/chartex" xmlns:cx5="http://schemas.microsoft.com/office/drawing/2016/5/11/chartex" xmlns:cx6="http://schemas.microsoft.com/office/drawing/2016/5/12/chartex" xmlns:cx7="http://schemas.microsoft.com/office/drawing/2016/5/13/chartex" xmlns:cx8="http://schemas.microsoft.com/office/drawing/2016/5/14/chartex" xmlns:mc="http://schemas.openxmlformats.org/markup-compatibility/2006" xmlns:aink="http://schemas.microsoft.com/office/drawing/2016/ink" xmlns:am3d="http://schemas.microsoft.com/office/drawing/2017/model3d" xmlns:o="urn:schemas-microsoft-com:office:office" xmlns:oel="http://schemas.microsoft.com/office/2019/extlst" xmlns:r="http://schemas.openxmlformats.org/officeDocument/2006/relationships" xmlns:m="http://schemas.openxmlformats.org/officeDocument/2006/math" xmlns:v="urn:schemas-microsoft-com:vml" xmlns:wp14="http://schemas.microsoft.com/office/word/2010/wordprocessingDrawing" xmlns:wp="http://schemas.openxmlformats.org/drawingml/2006/wordprocessingDrawing" xmlns:w10="urn:schemas-microsoft-com:office:word" xmlns:w="http://schemas.openxmlformats.org/wordprocessingml/2006/main" xmlns:w14="http://schemas.microsoft.com/office/word/2010/wordml" xmlns:w15="http://schemas.microsoft.com/office/word/2012/wordml" xmlns:w16cex="http://schemas.microsoft.com/office/word/2018/wordml/cex" xmlns:w16cid="http://schemas.microsoft.com/office/word/2016/wordml/cid" xmlns:w16="http://schemas.microsoft.com/office/word/2018/wordml" xmlns:w16du="http://schemas.microsoft.com/office/word/2023/wordml/word16du" xmlns:w16sdtdh="http://schemas.microsoft.com/office/word/2020/wordml/sdtdatahash" xmlns:w16sdtfl="http://schemas.microsoft.com/office/word/2024/wordml/sdtformatlock" xmlns:w16se="http://schemas.microsoft.com/office/word/2015/wordml/symex" xmlns:wpg="http://schemas.microsoft.com/office/word/2010/wordprocessingGroup" xmlns:wpi="http://schemas.microsoft.com/office/word/2010/wordprocessingInk" xmlns:wne="http://schemas.microsoft.com/office/word/2006/wordml" xmlns:wps="http://schemas.microsoft.com/office/word/2010/wordprocessingShape" mc:Ignorable="w14 w15 w16se w16cid w16 w16cex w16sdtdh w16sdtfl w16du wp14">
   <w:body>
+    <w:p>
+      <w:pPr>
+        <w:rPr>
+          <w:b/>
+          <w:bCs/>
+        </w:rPr>
+      </w:pPr>
+      <w:r>
+        <w:rPr>
+          <w:b/>
+          <w:bCs/>
+        </w:rPr>
+        <w:t>PRIMEIRO MOMENTO</w:t>
+      </w:r>
+    </w:p>
     <w:p>
       <w:pPr>
         <w:rPr>
@@ -164,7 +179,10 @@
     </w:p>
     <w:p>
       <w:pPr>
-        <w:spacing w:after="0"/>
+        <w:rPr>
+          <w:b/>
+          <w:bCs/>
+        </w:rPr>
       </w:pPr>
     </w:p>
     <w:p>
@@ -245,10 +263,7 @@
         </w:numPr>
       </w:pPr>
       <w:r>
-        <w:t>Propriedade</w:t>
-      </w:r>
-      <w:r>
-        <w:t xml:space="preserve"> de </w:t>
+        <w:t xml:space="preserve">Propriedade de </w:t>
       </w:r>
       <w:r>
         <w:t>D</w:t>
@@ -278,47 +293,140 @@
         </w:numPr>
       </w:pPr>
       <w:r>
-        <w:t>Propriedades Operacionais</w:t>
-      </w:r>
+        <w:t>Propriedades Operacionai</w:t>
+      </w:r>
+      <w:r>
+        <w:t>s</w:t>
+      </w:r>
+    </w:p>
+    <w:p>
+      <w:pPr>
+        <w:spacing w:after="0"/>
+        <w:rPr>
+          <w:b/>
+          <w:bCs/>
+        </w:rPr>
+      </w:pPr>
+    </w:p>
+    <w:p>
+      <w:pPr>
+        <w:spacing w:after="0"/>
+        <w:rPr>
+          <w:b/>
+          <w:bCs/>
+        </w:rPr>
+      </w:pPr>
+      <w:r>
+        <w:rPr>
+          <w:b/>
+          <w:bCs/>
+        </w:rPr>
+        <w:t xml:space="preserve">Unidade </w:t>
+      </w:r>
+      <w:r>
+        <w:rPr>
+          <w:b/>
+          <w:bCs/>
+        </w:rPr>
+        <w:t>4</w:t>
+      </w:r>
+      <w:r>
+        <w:rPr>
+          <w:b/>
+          <w:bCs/>
+        </w:rPr>
+        <w:t xml:space="preserve"> — Álgebra Booleana</w:t>
+      </w:r>
+      <w:r>
+        <w:rPr>
+          <w:b/>
+          <w:bCs/>
+        </w:rPr>
+        <w:t xml:space="preserve"> (Introdução)</w:t>
+      </w:r>
+    </w:p>
+    <w:p>
+      <w:pPr>
+        <w:spacing w:after="0"/>
+      </w:pPr>
+      <w:r>
+        <w:t>Ajuda na sintaxe para a simplificação de expressões</w:t>
+      </w:r>
+    </w:p>
+    <w:p>
+      <w:pPr>
+        <w:pStyle w:val="PargrafodaLista"/>
+        <w:spacing w:after="0"/>
+      </w:pPr>
     </w:p>
     <w:p>
       <w:pPr>
         <w:pStyle w:val="PargrafodaLista"/>
         <w:numPr>
           <w:ilvl w:val="0"/>
-          <w:numId w:val="5"/>
+          <w:numId w:val="10"/>
         </w:numPr>
-      </w:pPr>
-      <w:r>
-        <w:t>S</w:t>
-      </w:r>
-      <w:r>
-        <w:t>implificação</w:t>
-      </w:r>
-      <w:r>
-        <w:t xml:space="preserve"> de Expressões</w:t>
-      </w:r>
-    </w:p>
-    <w:p>
-      <w:pPr>
-        <w:spacing w:after="0"/>
-        <w:rPr>
-          <w:b/>
-          <w:bCs/>
-        </w:rPr>
-      </w:pPr>
-      <w:r>
-        <w:rPr>
-          <w:b/>
-          <w:bCs/>
-        </w:rPr>
-        <w:t>Unidade 4 — Argumentos e Inferência</w:t>
-      </w:r>
-    </w:p>
-    <w:p>
-      <w:pPr>
-        <w:spacing w:after="0"/>
-      </w:pPr>
+        <w:spacing w:after="0"/>
+      </w:pPr>
+      <w:r>
+        <w:t>Sintaxe da Álgebra booleana</w:t>
+      </w:r>
+    </w:p>
+    <w:p>
+      <w:pPr>
+        <w:pStyle w:val="PargrafodaLista"/>
+        <w:numPr>
+          <w:ilvl w:val="0"/>
+          <w:numId w:val="10"/>
+        </w:numPr>
+        <w:spacing w:after="0"/>
+      </w:pPr>
+      <w:r>
+        <w:t>Simplificação de Expressões</w:t>
+      </w:r>
+    </w:p>
+    <w:p>
+      <w:pPr>
+        <w:pStyle w:val="PargrafodaLista"/>
+        <w:spacing w:after="0"/>
+      </w:pPr>
+    </w:p>
+    <w:p>
+      <w:pPr>
+        <w:spacing w:after="0"/>
+        <w:rPr>
+          <w:b/>
+          <w:bCs/>
+        </w:rPr>
+      </w:pPr>
+      <w:r>
+        <w:rPr>
+          <w:b/>
+          <w:bCs/>
+        </w:rPr>
+        <w:t xml:space="preserve">Unidade </w:t>
+      </w:r>
+      <w:r>
+        <w:rPr>
+          <w:b/>
+          <w:bCs/>
+        </w:rPr>
+        <w:t>5</w:t>
+      </w:r>
+      <w:r>
+        <w:rPr>
+          <w:b/>
+          <w:bCs/>
+        </w:rPr>
+        <w:t xml:space="preserve"> — </w:t>
+      </w:r>
+      <w:r>
+        <w:rPr>
+          <w:b/>
+          <w:bCs/>
+        </w:rPr>
+        <w:t>Inferência Lógica</w:t>
+      </w:r>
     </w:p>
     <w:p>
       <w:pPr>
@@ -329,10 +437,22 @@
         </w:numPr>
       </w:pPr>
       <w:r>
+        <w:t>Inferência</w:t>
+      </w:r>
+      <w:r>
+        <w:t>,</w:t>
+      </w:r>
+      <w:r>
+        <w:t xml:space="preserve"> </w:t>
+      </w:r>
+      <w:r>
         <w:t>A</w:t>
       </w:r>
       <w:r>
         <w:t>rgumentos</w:t>
+      </w:r>
+      <w:r>
+        <w:t xml:space="preserve">  e validade</w:t>
       </w:r>
     </w:p>
     <w:p>
@@ -342,12 +462,16 @@
           <w:ilvl w:val="0"/>
           <w:numId w:val="6"/>
         </w:numPr>
-      </w:pPr>
-      <w:r>
-        <w:t>V</w:t>
-      </w:r>
-      <w:r>
-        <w:t>alidade</w:t>
+        <w:rPr>
+          <w:b/>
+          <w:bCs/>
+        </w:rPr>
+      </w:pPr>
+      <w:r>
+        <w:t>R</w:t>
+      </w:r>
+      <w:r>
+        <w:t>egras de inferência</w:t>
       </w:r>
     </w:p>
     <w:p>
@@ -357,82 +481,73 @@
           <w:ilvl w:val="0"/>
           <w:numId w:val="6"/>
         </w:numPr>
-      </w:pPr>
-      <w:r>
-        <w:t>R</w:t>
-      </w:r>
-      <w:r>
-        <w:t>egras de inferência</w:t>
-      </w:r>
-      <w:r>
-        <w:t>:</w:t>
+        <w:rPr>
+          <w:b/>
+          <w:bCs/>
+        </w:rPr>
+      </w:pPr>
+      <w:r>
+        <w:t>Raciocínio Inferencial</w:t>
       </w:r>
     </w:p>
     <w:p>
       <w:pPr>
         <w:pStyle w:val="PargrafodaLista"/>
-        <w:numPr>
-          <w:ilvl w:val="1"/>
-          <w:numId w:val="6"/>
-        </w:numPr>
-      </w:pPr>
-      <w:r>
-        <w:t>M</w:t>
-      </w:r>
-      <w:r>
-        <w:t>odus ponens</w:t>
-      </w:r>
-    </w:p>
-    <w:p>
-      <w:pPr>
-        <w:pStyle w:val="PargrafodaLista"/>
-        <w:numPr>
-          <w:ilvl w:val="1"/>
-          <w:numId w:val="6"/>
-        </w:numPr>
-      </w:pPr>
-      <w:r>
-        <w:t>M</w:t>
-      </w:r>
-      <w:r>
-        <w:t>odus tollens</w:t>
-      </w:r>
-    </w:p>
-    <w:p>
-      <w:pPr>
-        <w:pStyle w:val="PargrafodaLista"/>
-        <w:numPr>
-          <w:ilvl w:val="1"/>
-          <w:numId w:val="6"/>
-        </w:numPr>
-      </w:pPr>
-      <w:r>
-        <w:t>S</w:t>
-      </w:r>
-      <w:r>
-        <w:t>ilogismos</w:t>
-      </w:r>
-    </w:p>
-    <w:p>
-      <w:pPr>
-        <w:spacing w:after="0"/>
-        <w:rPr>
-          <w:b/>
-          <w:bCs/>
-        </w:rPr>
-      </w:pPr>
-      <w:r>
-        <w:rPr>
-          <w:b/>
-          <w:bCs/>
-        </w:rPr>
-        <w:t>Unidade 5 — Predicados e Quantificadores</w:t>
-      </w:r>
-    </w:p>
-    <w:p>
-      <w:pPr>
-        <w:spacing w:after="0"/>
-      </w:pPr>
+        <w:rPr>
+          <w:b/>
+          <w:bCs/>
+        </w:rPr>
+      </w:pPr>
+    </w:p>
+    <w:p>
+      <w:pPr>
+        <w:rPr>
+          <w:b/>
+          <w:bCs/>
+        </w:rPr>
+      </w:pPr>
+      <w:r>
+        <w:rPr>
+          <w:b/>
+          <w:bCs/>
+        </w:rPr>
+        <w:t xml:space="preserve">Unidade </w:t>
+      </w:r>
+      <w:r>
+        <w:rPr>
+          <w:b/>
+          <w:bCs/>
+        </w:rPr>
+        <w:t>6</w:t>
+      </w:r>
+      <w:r>
+        <w:rPr>
+          <w:b/>
+          <w:bCs/>
+        </w:rPr>
+        <w:t xml:space="preserve"> — Predicados</w:t>
+      </w:r>
+      <w:r>
+        <w:rPr>
+          <w:b/>
+          <w:bCs/>
+        </w:rPr>
+        <w:t>,</w:t>
+      </w:r>
+      <w:r>
+        <w:rPr>
+          <w:b/>
+          <w:bCs/>
+        </w:rPr>
+        <w:t xml:space="preserve"> Quantificadores</w:t>
+      </w:r>
+      <w:r>
+        <w:rPr>
+          <w:b/>
+          <w:bCs/>
+        </w:rPr>
+        <w:t xml:space="preserve"> e Demonstrações</w:t>
+      </w:r>
     </w:p>
     <w:p>
       <w:pPr>
@@ -446,7 +561,28 @@
         <w:t>V</w:t>
       </w:r>
       <w:r>
-        <w:t xml:space="preserve">ariáveis </w:t>
+        <w:t>ariáveis</w:t>
+      </w:r>
+      <w:r>
+        <w:t xml:space="preserve">, </w:t>
+      </w:r>
+      <w:r>
+        <w:t>P</w:t>
+      </w:r>
+      <w:r>
+        <w:t>redicados</w:t>
+      </w:r>
+      <w:r>
+        <w:t xml:space="preserve"> e</w:t>
+      </w:r>
+      <w:r>
+        <w:t xml:space="preserve"> </w:t>
+      </w:r>
+      <w:r>
+        <w:t>U</w:t>
+      </w:r>
+      <w:r>
+        <w:t xml:space="preserve">niverso </w:t>
       </w:r>
     </w:p>
     <w:p>
@@ -458,90 +594,19 @@
         <w:spacing w:after="0"/>
       </w:pPr>
       <w:r>
-        <w:t>P</w:t>
-      </w:r>
-      <w:r>
-        <w:t xml:space="preserve">redicados </w:t>
-      </w:r>
-    </w:p>
-    <w:p>
-      <w:pPr>
-        <w:numPr>
-          <w:ilvl w:val="0"/>
-          <w:numId w:val="7"/>
-        </w:numPr>
-        <w:spacing w:after="0"/>
-      </w:pPr>
-      <w:r>
-        <w:t>U</w:t>
-      </w:r>
-      <w:r>
-        <w:t xml:space="preserve">niverso </w:t>
-      </w:r>
-    </w:p>
-    <w:p>
-      <w:pPr>
-        <w:numPr>
-          <w:ilvl w:val="0"/>
-          <w:numId w:val="7"/>
-        </w:numPr>
-        <w:spacing w:after="0"/>
-      </w:pPr>
-      <w:r>
         <w:t>Q</w:t>
       </w:r>
       <w:r>
-        <w:t xml:space="preserve">uantificadores </w:t>
-      </w:r>
-    </w:p>
-    <w:p>
-      <w:pPr>
-        <w:numPr>
-          <w:ilvl w:val="0"/>
-          <w:numId w:val="8"/>
-        </w:numPr>
-        <w:spacing w:after="0"/>
-      </w:pPr>
+        <w:t>uantificadores</w:t>
+      </w:r>
+      <w:r>
+        <w:t xml:space="preserve"> e </w:t>
+      </w:r>
       <w:r>
         <w:t>N</w:t>
       </w:r>
       <w:r>
         <w:t xml:space="preserve">egação de quantificadores </w:t>
-      </w:r>
-    </w:p>
-    <w:p>
-      <w:pPr>
-        <w:numPr>
-          <w:ilvl w:val="0"/>
-          <w:numId w:val="8"/>
-        </w:numPr>
-        <w:spacing w:after="0"/>
-      </w:pPr>
-      <w:r>
-        <w:t>E</w:t>
-      </w:r>
-      <w:r>
-        <w:t>quivalências</w:t>
-      </w:r>
-    </w:p>
-    <w:p>
-      <w:pPr>
-        <w:spacing w:after="0"/>
-      </w:pPr>
-    </w:p>
-    <w:p>
-      <w:pPr>
-        <w:rPr>
-          <w:b/>
-          <w:bCs/>
-        </w:rPr>
-      </w:pPr>
-      <w:r>
-        <w:rPr>
-          <w:b/>
-          <w:bCs/>
-        </w:rPr>
-        <w:t>Unidade 6 — Demonstrações</w:t>
       </w:r>
     </w:p>
     <w:p>
@@ -549,120 +614,71 @@
         <w:pStyle w:val="PargrafodaLista"/>
         <w:numPr>
           <w:ilvl w:val="0"/>
-          <w:numId w:val="9"/>
+          <w:numId w:val="14"/>
         </w:numPr>
         <w:spacing w:after="0"/>
       </w:pPr>
       <w:r>
-        <w:t>Demonstração direta</w:t>
-      </w:r>
-    </w:p>
-    <w:p>
-      <w:pPr>
-        <w:pStyle w:val="PargrafodaLista"/>
-        <w:numPr>
-          <w:ilvl w:val="0"/>
-          <w:numId w:val="9"/>
-        </w:numPr>
-        <w:spacing w:after="0"/>
-      </w:pPr>
+        <w:t xml:space="preserve">Demonstração </w:t>
+      </w:r>
+      <w:r>
+        <w:t>D</w:t>
+      </w:r>
+      <w:r>
+        <w:t>ireta</w:t>
+      </w:r>
+      <w:r>
+        <w:t xml:space="preserve"> e </w:t>
+      </w:r>
       <w:r>
         <w:t>Contrapositiva</w:t>
       </w:r>
     </w:p>
     <w:p>
       <w:pPr>
-        <w:pStyle w:val="PargrafodaLista"/>
-        <w:numPr>
-          <w:ilvl w:val="0"/>
-          <w:numId w:val="9"/>
-        </w:numPr>
-        <w:spacing w:after="0"/>
-      </w:pPr>
-      <w:r>
-        <w:t>Contradição</w:t>
-      </w:r>
-    </w:p>
-    <w:p>
-      <w:pPr>
-        <w:pStyle w:val="PargrafodaLista"/>
-        <w:numPr>
-          <w:ilvl w:val="0"/>
-          <w:numId w:val="9"/>
-        </w:numPr>
-        <w:spacing w:after="0"/>
-      </w:pPr>
-      <w:r>
-        <w:t>Indução</w:t>
-      </w:r>
-    </w:p>
-    <w:p>
-      <w:pPr>
-        <w:spacing w:after="0"/>
-      </w:pPr>
-    </w:p>
-    <w:p>
-      <w:pPr>
-        <w:spacing w:after="0"/>
-      </w:pPr>
-    </w:p>
-    <w:p>
-      <w:pPr>
-        <w:spacing w:after="0"/>
-      </w:pPr>
-    </w:p>
-    <w:p>
-      <w:pPr>
-        <w:spacing w:after="0"/>
-      </w:pPr>
-    </w:p>
-    <w:p>
-      <w:pPr>
-        <w:spacing w:after="0"/>
-      </w:pPr>
-    </w:p>
-    <w:p>
-      <w:pPr>
-        <w:spacing w:after="0"/>
-      </w:pPr>
-    </w:p>
-    <w:p>
-      <w:pPr>
-        <w:spacing w:after="0"/>
-        <w:rPr>
-          <w:b/>
-          <w:bCs/>
-        </w:rPr>
-      </w:pPr>
-      <w:r>
-        <w:rPr>
-          <w:b/>
-          <w:bCs/>
-        </w:rPr>
-        <w:t>Unidade 7 — Álgebra Booleana</w:t>
-      </w:r>
-    </w:p>
-    <w:p>
-      <w:pPr>
-        <w:spacing w:after="0"/>
-      </w:pPr>
-      <w:r>
-        <w:t xml:space="preserve">Faz </w:t>
-      </w:r>
-      <w:r>
-        <w:t xml:space="preserve">a ligação entre lógica e </w:t>
-      </w:r>
-      <w:r>
-        <w:t>a eletrônica</w:t>
-      </w:r>
-      <w:r>
-        <w:t>.</w:t>
-      </w:r>
-    </w:p>
-    <w:p>
-      <w:pPr>
-        <w:spacing w:after="0"/>
-      </w:pPr>
+        <w:spacing w:after="0"/>
+        <w:rPr>
+          <w:b/>
+          <w:bCs/>
+        </w:rPr>
+      </w:pPr>
+    </w:p>
+    <w:p>
+      <w:pPr>
+        <w:spacing w:after="0"/>
+        <w:rPr>
+          <w:b/>
+          <w:bCs/>
+        </w:rPr>
+      </w:pPr>
+      <w:r>
+        <w:rPr>
+          <w:b/>
+          <w:bCs/>
+        </w:rPr>
+        <w:t xml:space="preserve">Unidade </w:t>
+      </w:r>
+      <w:r>
+        <w:rPr>
+          <w:b/>
+          <w:bCs/>
+        </w:rPr>
+        <w:t>8</w:t>
+      </w:r>
+      <w:r>
+        <w:rPr>
+          <w:b/>
+          <w:bCs/>
+        </w:rPr>
+        <w:t xml:space="preserve"> — Álgebra Booleana</w:t>
+      </w:r>
+      <w:r>
+        <w:rPr>
+          <w:b/>
+          <w:bCs/>
+        </w:rPr>
+        <w:t xml:space="preserve"> (Aprofundamento)</w:t>
+      </w:r>
     </w:p>
     <w:p>
       <w:pPr>
@@ -674,10 +690,7 @@
         <w:spacing w:after="0"/>
       </w:pPr>
       <w:r>
-        <w:t>Á</w:t>
-      </w:r>
-      <w:r>
-        <w:t>lgebra booleana</w:t>
+        <w:t>Portas Lógicas</w:t>
       </w:r>
     </w:p>
     <w:p>
@@ -690,68 +703,113 @@
         <w:spacing w:after="0"/>
       </w:pPr>
       <w:r>
-        <w:t>P</w:t>
-      </w:r>
-      <w:r>
-        <w:t>ortas lógicas</w:t>
+        <w:t>Mapa de Karnaugh</w:t>
       </w:r>
     </w:p>
     <w:p>
       <w:pPr>
         <w:pStyle w:val="PargrafodaLista"/>
-        <w:numPr>
-          <w:ilvl w:val="0"/>
-          <w:numId w:val="10"/>
-        </w:numPr>
-        <w:spacing w:after="0"/>
-      </w:pPr>
-      <w:r>
-        <w:t>S</w:t>
-      </w:r>
-      <w:r>
-        <w:t>implificação</w:t>
-      </w:r>
+        <w:spacing w:after="0"/>
+      </w:pPr>
     </w:p>
     <w:p>
       <w:pPr>
         <w:pStyle w:val="PargrafodaLista"/>
-        <w:numPr>
-          <w:ilvl w:val="0"/>
-          <w:numId w:val="10"/>
-        </w:numPr>
-        <w:spacing w:after="0"/>
-      </w:pPr>
-      <w:r>
-        <w:t>Karnaugh (introdução)</w:t>
-      </w:r>
-    </w:p>
-    <w:p>
-      <w:pPr>
-        <w:spacing w:after="0"/>
-      </w:pPr>
-    </w:p>
-    <w:p>
-      <w:pPr>
-        <w:spacing w:after="0"/>
-        <w:rPr>
-          <w:b/>
-          <w:bCs/>
-        </w:rPr>
-      </w:pPr>
-      <w:r>
-        <w:rPr>
-          <w:b/>
-          <w:bCs/>
-        </w:rPr>
-        <w:t>Unidade 8 — Conjuntos</w:t>
-      </w:r>
-    </w:p>
-    <w:p>
-      <w:pPr>
-        <w:spacing w:after="0"/>
-      </w:pPr>
-      <w:r>
-        <w:t xml:space="preserve">Faz </w:t>
+        <w:spacing w:after="0"/>
+      </w:pPr>
+    </w:p>
+    <w:p>
+      <w:pPr>
+        <w:pStyle w:val="PargrafodaLista"/>
+        <w:spacing w:after="0"/>
+      </w:pPr>
+    </w:p>
+    <w:p>
+      <w:pPr>
+        <w:spacing w:after="0"/>
+        <w:rPr>
+          <w:b/>
+          <w:bCs/>
+        </w:rPr>
+      </w:pPr>
+    </w:p>
+    <w:p>
+      <w:pPr>
+        <w:spacing w:after="0"/>
+        <w:rPr>
+          <w:b/>
+          <w:bCs/>
+        </w:rPr>
+      </w:pPr>
+    </w:p>
+    <w:p>
+      <w:pPr>
+        <w:spacing w:after="0"/>
+        <w:rPr>
+          <w:b/>
+          <w:bCs/>
+        </w:rPr>
+      </w:pPr>
+      <w:r>
+        <w:rPr>
+          <w:b/>
+          <w:bCs/>
+        </w:rPr>
+        <w:lastRenderedPageBreak/>
+        <w:t>SEGUNDO MOMENTO</w:t>
+      </w:r>
+    </w:p>
+    <w:p>
+      <w:pPr>
+        <w:spacing w:after="0"/>
+        <w:rPr>
+          <w:b/>
+          <w:bCs/>
+        </w:rPr>
+      </w:pPr>
+    </w:p>
+    <w:p>
+      <w:pPr>
+        <w:spacing w:after="0"/>
+        <w:rPr>
+          <w:b/>
+          <w:bCs/>
+        </w:rPr>
+      </w:pPr>
+      <w:r>
+        <w:rPr>
+          <w:b/>
+          <w:bCs/>
+        </w:rPr>
+        <w:t xml:space="preserve">Unidade </w:t>
+      </w:r>
+      <w:r>
+        <w:rPr>
+          <w:b/>
+          <w:bCs/>
+        </w:rPr>
+        <w:t>9</w:t>
+      </w:r>
+      <w:r>
+        <w:rPr>
+          <w:b/>
+          <w:bCs/>
+        </w:rPr>
+        <w:t xml:space="preserve"> — Conjuntos</w:t>
+      </w:r>
+    </w:p>
+    <w:p>
+      <w:pPr>
+        <w:spacing w:after="0"/>
+      </w:pPr>
+      <w:r>
+        <w:t>Faz</w:t>
+      </w:r>
+      <w:r>
+        <w:t>er</w:t>
+      </w:r>
+      <w:r>
+        <w:t xml:space="preserve"> </w:t>
       </w:r>
       <w:r>
         <w:t>a ligação entre lógica e estruturas de dados.</w:t>
@@ -901,13 +959,22 @@
           <w:b/>
           <w:bCs/>
         </w:rPr>
-        <w:t>Unidade 9 — Relações</w:t>
-      </w:r>
-    </w:p>
-    <w:p>
-      <w:pPr>
-        <w:spacing w:after="0"/>
-      </w:pPr>
+        <w:t xml:space="preserve">Unidade </w:t>
+      </w:r>
+      <w:r>
+        <w:rPr>
+          <w:b/>
+          <w:bCs/>
+        </w:rPr>
+        <w:t>10</w:t>
+      </w:r>
+      <w:r>
+        <w:rPr>
+          <w:b/>
+          <w:bCs/>
+        </w:rPr>
+        <w:t xml:space="preserve"> — Relações</w:t>
+      </w:r>
     </w:p>
     <w:p>
       <w:pPr>
@@ -981,13 +1048,22 @@
           <w:b/>
           <w:bCs/>
         </w:rPr>
-        <w:t>Unidade 10 — Funções</w:t>
-      </w:r>
-    </w:p>
-    <w:p>
-      <w:pPr>
-        <w:spacing w:after="0"/>
-      </w:pPr>
+        <w:t>Unidade 1</w:t>
+      </w:r>
+      <w:r>
+        <w:rPr>
+          <w:b/>
+          <w:bCs/>
+        </w:rPr>
+        <w:t>1</w:t>
+      </w:r>
+      <w:r>
+        <w:rPr>
+          <w:b/>
+          <w:bCs/>
+        </w:rPr>
+        <w:t xml:space="preserve"> — Funções</w:t>
+      </w:r>
     </w:p>
     <w:p>
       <w:pPr>
@@ -1864,6 +1940,119 @@
     </w:lvl>
   </w:abstractNum>
   <w:abstractNum w:abstractNumId="6" w15:restartNumberingAfterBreak="0">
+    <w:nsid w:val="1BF11175"/>
+    <w:multiLevelType w:val="hybridMultilevel"/>
+    <w:tmpl w:val="C4E62484"/>
+    <w:lvl w:ilvl="0" w:tplc="04160001">
+      <w:start w:val="1"/>
+      <w:numFmt w:val="bullet"/>
+      <w:lvlText w:val=""/>
+      <w:lvlJc w:val="left"/>
+      <w:pPr>
+        <w:ind w:left="720" w:hanging="360"/>
+      </w:pPr>
+      <w:rPr>
+        <w:rFonts w:ascii="Symbol" w:hAnsi="Symbol" w:hint="default"/>
+      </w:rPr>
+    </w:lvl>
+    <w:lvl w:ilvl="1" w:tplc="04160003" w:tentative="1">
+      <w:start w:val="1"/>
+      <w:numFmt w:val="bullet"/>
+      <w:lvlText w:val="o"/>
+      <w:lvlJc w:val="left"/>
+      <w:pPr>
+        <w:ind w:left="1440" w:hanging="360"/>
+      </w:pPr>
+      <w:rPr>
+        <w:rFonts w:ascii="Courier New" w:hAnsi="Courier New" w:cs="Courier New" w:hint="default"/>
+      </w:rPr>
+    </w:lvl>
+    <w:lvl w:ilvl="2" w:tplc="04160005" w:tentative="1">
+      <w:start w:val="1"/>
+      <w:numFmt w:val="bullet"/>
+      <w:lvlText w:val=""/>
+      <w:lvlJc w:val="left"/>
+      <w:pPr>
+        <w:ind w:left="2160" w:hanging="360"/>
+      </w:pPr>
+      <w:rPr>
+        <w:rFonts w:ascii="Wingdings" w:hAnsi="Wingdings" w:hint="default"/>
+      </w:rPr>
+    </w:lvl>
+    <w:lvl w:ilvl="3" w:tplc="04160001" w:tentative="1">
+      <w:start w:val="1"/>
+      <w:numFmt w:val="bullet"/>
+      <w:lvlText w:val=""/>
+      <w:lvlJc w:val="left"/>
+      <w:pPr>
+        <w:ind w:left="2880" w:hanging="360"/>
+      </w:pPr>
+      <w:rPr>
+        <w:rFonts w:ascii="Symbol" w:hAnsi="Symbol" w:hint="default"/>
+      </w:rPr>
+    </w:lvl>
+    <w:lvl w:ilvl="4" w:tplc="04160003" w:tentative="1">
+      <w:start w:val="1"/>
+      <w:numFmt w:val="bullet"/>
+      <w:lvlText w:val="o"/>
+      <w:lvlJc w:val="left"/>
+      <w:pPr>
+        <w:ind w:left="3600" w:hanging="360"/>
+      </w:pPr>
+      <w:rPr>
+        <w:rFonts w:ascii="Courier New" w:hAnsi="Courier New" w:cs="Courier New" w:hint="default"/>
+      </w:rPr>
+    </w:lvl>
+    <w:lvl w:ilvl="5" w:tplc="04160005" w:tentative="1">
+      <w:start w:val="1"/>
+      <w:numFmt w:val="bullet"/>
+      <w:lvlText w:val=""/>
+      <w:lvlJc w:val="left"/>
+      <w:pPr>
+        <w:ind w:left="4320" w:hanging="360"/>
+      </w:pPr>
+      <w:rPr>
+        <w:rFonts w:ascii="Wingdings" w:hAnsi="Wingdings" w:hint="default"/>
+      </w:rPr>
+    </w:lvl>
+    <w:lvl w:ilvl="6" w:tplc="04160001" w:tentative="1">
+      <w:start w:val="1"/>
+      <w:numFmt w:val="bullet"/>
+      <w:lvlText w:val=""/>
+      <w:lvlJc w:val="left"/>
+      <w:pPr>
+        <w:ind w:left="5040" w:hanging="360"/>
+      </w:pPr>
+      <w:rPr>
+        <w:rFonts w:ascii="Symbol" w:hAnsi="Symbol" w:hint="default"/>
+      </w:rPr>
+    </w:lvl>
+    <w:lvl w:ilvl="7" w:tplc="04160003" w:tentative="1">
+      <w:start w:val="1"/>
+      <w:numFmt w:val="bullet"/>
+      <w:lvlText w:val="o"/>
+      <w:lvlJc w:val="left"/>
+      <w:pPr>
+        <w:ind w:left="5760" w:hanging="360"/>
+      </w:pPr>
+      <w:rPr>
+        <w:rFonts w:ascii="Courier New" w:hAnsi="Courier New" w:cs="Courier New" w:hint="default"/>
+      </w:rPr>
+    </w:lvl>
+    <w:lvl w:ilvl="8" w:tplc="04160005" w:tentative="1">
+      <w:start w:val="1"/>
+      <w:numFmt w:val="bullet"/>
+      <w:lvlText w:val=""/>
+      <w:lvlJc w:val="left"/>
+      <w:pPr>
+        <w:ind w:left="6480" w:hanging="360"/>
+      </w:pPr>
+      <w:rPr>
+        <w:rFonts w:ascii="Wingdings" w:hAnsi="Wingdings" w:hint="default"/>
+      </w:rPr>
+    </w:lvl>
+  </w:abstractNum>
+  <w:abstractNum w:abstractNumId="7" w15:restartNumberingAfterBreak="0">
     <w:nsid w:val="318D3600"/>
     <w:multiLevelType w:val="hybridMultilevel"/>
     <w:tmpl w:val="CC24F5C6"/>
@@ -1976,7 +2165,7 @@
       </w:rPr>
     </w:lvl>
   </w:abstractNum>
-  <w:abstractNum w:abstractNumId="7" w15:restartNumberingAfterBreak="0">
+  <w:abstractNum w:abstractNumId="8" w15:restartNumberingAfterBreak="0">
     <w:nsid w:val="31C20F75"/>
     <w:multiLevelType w:val="multilevel"/>
     <w:tmpl w:val="817E5B08"/>
@@ -2125,7 +2314,7 @@
       </w:rPr>
     </w:lvl>
   </w:abstractNum>
-  <w:abstractNum w:abstractNumId="8" w15:restartNumberingAfterBreak="0">
+  <w:abstractNum w:abstractNumId="9" w15:restartNumberingAfterBreak="0">
     <w:nsid w:val="435270B7"/>
     <w:multiLevelType w:val="multilevel"/>
     <w:tmpl w:val="C7BE6714"/>
@@ -2274,7 +2463,7 @@
       </w:rPr>
     </w:lvl>
   </w:abstractNum>
-  <w:abstractNum w:abstractNumId="9" w15:restartNumberingAfterBreak="0">
+  <w:abstractNum w:abstractNumId="10" w15:restartNumberingAfterBreak="0">
     <w:nsid w:val="56F71B52"/>
     <w:multiLevelType w:val="hybridMultilevel"/>
     <w:tmpl w:val="7C3EF370"/>
@@ -2360,7 +2549,7 @@
       </w:pPr>
     </w:lvl>
   </w:abstractNum>
-  <w:abstractNum w:abstractNumId="10" w15:restartNumberingAfterBreak="0">
+  <w:abstractNum w:abstractNumId="11" w15:restartNumberingAfterBreak="0">
     <w:nsid w:val="57AE07EC"/>
     <w:multiLevelType w:val="multilevel"/>
     <w:tmpl w:val="28B4CEA0"/>
@@ -2473,7 +2662,7 @@
       </w:pPr>
     </w:lvl>
   </w:abstractNum>
-  <w:abstractNum w:abstractNumId="11" w15:restartNumberingAfterBreak="0">
+  <w:abstractNum w:abstractNumId="12" w15:restartNumberingAfterBreak="0">
     <w:nsid w:val="724F0688"/>
     <w:multiLevelType w:val="hybridMultilevel"/>
     <w:tmpl w:val="6712785C"/>
@@ -2559,7 +2748,7 @@
       </w:pPr>
     </w:lvl>
   </w:abstractNum>
-  <w:abstractNum w:abstractNumId="12" w15:restartNumberingAfterBreak="0">
+  <w:abstractNum w:abstractNumId="13" w15:restartNumberingAfterBreak="0">
     <w:nsid w:val="7B1F1EA4"/>
     <w:multiLevelType w:val="hybridMultilevel"/>
     <w:tmpl w:val="4DD44AE4"/>
@@ -2673,19 +2862,19 @@
     </w:lvl>
   </w:abstractNum>
   <w:num w:numId="1" w16cid:durableId="950749468">
-    <w:abstractNumId w:val="10"/>
+    <w:abstractNumId w:val="11"/>
   </w:num>
   <w:num w:numId="2" w16cid:durableId="91829190">
-    <w:abstractNumId w:val="8"/>
+    <w:abstractNumId w:val="9"/>
   </w:num>
   <w:num w:numId="3" w16cid:durableId="1308704370">
-    <w:abstractNumId w:val="9"/>
+    <w:abstractNumId w:val="10"/>
   </w:num>
   <w:num w:numId="4" w16cid:durableId="1533030519">
     <w:abstractNumId w:val="1"/>
   </w:num>
   <w:num w:numId="5" w16cid:durableId="459736682">
-    <w:abstractNumId w:val="6"/>
+    <w:abstractNumId w:val="7"/>
   </w:num>
   <w:num w:numId="6" w16cid:durableId="2067414333">
     <w:abstractNumId w:val="0"/>
@@ -2694,10 +2883,10 @@
     <w:abstractNumId w:val="2"/>
   </w:num>
   <w:num w:numId="8" w16cid:durableId="1627272422">
-    <w:abstractNumId w:val="7"/>
+    <w:abstractNumId w:val="8"/>
   </w:num>
   <w:num w:numId="9" w16cid:durableId="311911500">
-    <w:abstractNumId w:val="11"/>
+    <w:abstractNumId w:val="12"/>
   </w:num>
   <w:num w:numId="10" w16cid:durableId="1050619330">
     <w:abstractNumId w:val="5"/>
@@ -2706,10 +2895,13 @@
     <w:abstractNumId w:val="3"/>
   </w:num>
   <w:num w:numId="12" w16cid:durableId="12877491">
-    <w:abstractNumId w:val="12"/>
+    <w:abstractNumId w:val="13"/>
   </w:num>
   <w:num w:numId="13" w16cid:durableId="692652526">
     <w:abstractNumId w:val="4"/>
+  </w:num>
+  <w:num w:numId="14" w16cid:durableId="386034482">
+    <w:abstractNumId w:val="6"/>
   </w:num>
 </w:numbering>
 </file>

</xml_diff>

<commit_message>
Atualização de aulas MD PT2 17/08
</commit_message>
<xml_diff>
--- a/UNIUBE-MD/Conteudo.docx
+++ b/UNIUBE-MD/Conteudo.docx
@@ -452,7 +452,7 @@
         <w:t>rgumentos</w:t>
       </w:r>
       <w:r>
-        <w:t xml:space="preserve">  e validade</w:t>
+        <w:t xml:space="preserve"> e validade</w:t>
       </w:r>
     </w:p>
     <w:p>
@@ -477,22 +477,6 @@
     <w:p>
       <w:pPr>
         <w:pStyle w:val="PargrafodaLista"/>
-        <w:numPr>
-          <w:ilvl w:val="0"/>
-          <w:numId w:val="6"/>
-        </w:numPr>
-        <w:rPr>
-          <w:b/>
-          <w:bCs/>
-        </w:rPr>
-      </w:pPr>
-      <w:r>
-        <w:t>Raciocínio Inferencial</w:t>
-      </w:r>
-    </w:p>
-    <w:p>
-      <w:pPr>
-        <w:pStyle w:val="PargrafodaLista"/>
         <w:rPr>
           <w:b/>
           <w:bCs/>
@@ -630,9 +614,11 @@
       <w:r>
         <w:t xml:space="preserve"> e </w:t>
       </w:r>
+      <w:proofErr w:type="spellStart"/>
       <w:r>
         <w:t>Contrapositiva</w:t>
       </w:r>
+      <w:proofErr w:type="spellEnd"/>
     </w:p>
     <w:p>
       <w:pPr>
@@ -703,8 +689,13 @@
         <w:spacing w:after="0"/>
       </w:pPr>
       <w:r>
-        <w:t>Mapa de Karnaugh</w:t>
-      </w:r>
+        <w:t xml:space="preserve">Mapa de </w:t>
+      </w:r>
+      <w:proofErr w:type="spellStart"/>
+      <w:r>
+        <w:t>Karnaugh</w:t>
+      </w:r>
+      <w:proofErr w:type="spellEnd"/>
     </w:p>
     <w:p>
       <w:pPr>
@@ -722,6 +713,15 @@
       <w:pPr>
         <w:pStyle w:val="PargrafodaLista"/>
         <w:spacing w:after="0"/>
+      </w:pPr>
+    </w:p>
+    <w:p>
+      <w:pPr>
+        <w:spacing w:after="0"/>
+        <w:rPr>
+          <w:b/>
+          <w:bCs/>
+        </w:rPr>
       </w:pPr>
     </w:p>
     <w:p>
@@ -1154,12 +1154,14 @@
         </w:numPr>
         <w:spacing w:after="0"/>
       </w:pPr>
+      <w:proofErr w:type="spellStart"/>
       <w:r>
         <w:t>S</w:t>
       </w:r>
       <w:r>
         <w:t>obrejetoras</w:t>
       </w:r>
+      <w:proofErr w:type="spellEnd"/>
     </w:p>
     <w:p>
       <w:pPr>

</xml_diff>